<commit_message>
Complete production-ready Word/DOCX export parity
- Add editable Current View DOCX with Exact View and Clean Report support
- Support FullData, Selected, AllFiltered, and DOCX templates
- Export DataGrid2 as semantic Word tables
- Support Portrait, Landscape, and Auto orientation with configurable margins
- Add smart page breaks, repeating table headers, and runtime form values
- Preserve RichText, lists, hyperlinks, images, and Turkish Unicode
- Extend Auto Export and processing notices to Word
- Add ExportKey two-stage flow with background-tab-safe execution
- Validate the 25K Word stress benchmark
- Preserve the complete PDF regression suite
</commit_message>
<xml_diff>
--- a/dist/word-stress-output/word-100.docx
+++ b/dist/word-stress-output/word-100.docx
@@ -5,6 +5,8 @@
     <w:p>
       <w:pPr>
         <w:pStyle w:val="Heading1"/>
+        <w:keepNext w:val="on"/>
+        <w:keepLines/>
       </w:pPr>
       <w:r>
         <w:rPr>
@@ -31,6 +33,7 @@
       <w:tr>
         <w:trPr>
           <w:tblHeader w:val="on"/>
+          <w:cantSplit w:val="on"/>
         </w:trPr>
         <w:tc>
           <w:p>
@@ -70,6 +73,9 @@
         </w:tc>
       </w:tr>
       <w:tr>
+        <w:trPr>
+          <w:cantSplit w:val="on"/>
+        </w:trPr>
         <w:tc>
           <w:p>
             <w:r>
@@ -108,6 +114,9 @@
         </w:tc>
       </w:tr>
       <w:tr>
+        <w:trPr>
+          <w:cantSplit w:val="on"/>
+        </w:trPr>
         <w:tc>
           <w:p>
             <w:r>
@@ -146,6 +155,9 @@
         </w:tc>
       </w:tr>
       <w:tr>
+        <w:trPr>
+          <w:cantSplit w:val="on"/>
+        </w:trPr>
         <w:tc>
           <w:p>
             <w:r>
@@ -184,6 +196,9 @@
         </w:tc>
       </w:tr>
       <w:tr>
+        <w:trPr>
+          <w:cantSplit w:val="on"/>
+        </w:trPr>
         <w:tc>
           <w:p>
             <w:r>
@@ -222,6 +237,9 @@
         </w:tc>
       </w:tr>
       <w:tr>
+        <w:trPr>
+          <w:cantSplit w:val="on"/>
+        </w:trPr>
         <w:tc>
           <w:p>
             <w:r>
@@ -260,6 +278,9 @@
         </w:tc>
       </w:tr>
       <w:tr>
+        <w:trPr>
+          <w:cantSplit w:val="on"/>
+        </w:trPr>
         <w:tc>
           <w:p>
             <w:r>
@@ -298,6 +319,9 @@
         </w:tc>
       </w:tr>
       <w:tr>
+        <w:trPr>
+          <w:cantSplit w:val="on"/>
+        </w:trPr>
         <w:tc>
           <w:p>
             <w:r>
@@ -336,6 +360,9 @@
         </w:tc>
       </w:tr>
       <w:tr>
+        <w:trPr>
+          <w:cantSplit w:val="on"/>
+        </w:trPr>
         <w:tc>
           <w:p>
             <w:r>
@@ -374,6 +401,9 @@
         </w:tc>
       </w:tr>
       <w:tr>
+        <w:trPr>
+          <w:cantSplit w:val="on"/>
+        </w:trPr>
         <w:tc>
           <w:p>
             <w:r>
@@ -412,6 +442,9 @@
         </w:tc>
       </w:tr>
       <w:tr>
+        <w:trPr>
+          <w:cantSplit w:val="on"/>
+        </w:trPr>
         <w:tc>
           <w:p>
             <w:r>
@@ -450,6 +483,9 @@
         </w:tc>
       </w:tr>
       <w:tr>
+        <w:trPr>
+          <w:cantSplit w:val="on"/>
+        </w:trPr>
         <w:tc>
           <w:p>
             <w:r>
@@ -488,6 +524,9 @@
         </w:tc>
       </w:tr>
       <w:tr>
+        <w:trPr>
+          <w:cantSplit w:val="on"/>
+        </w:trPr>
         <w:tc>
           <w:p>
             <w:r>
@@ -526,6 +565,9 @@
         </w:tc>
       </w:tr>
       <w:tr>
+        <w:trPr>
+          <w:cantSplit w:val="on"/>
+        </w:trPr>
         <w:tc>
           <w:p>
             <w:r>
@@ -564,6 +606,9 @@
         </w:tc>
       </w:tr>
       <w:tr>
+        <w:trPr>
+          <w:cantSplit w:val="on"/>
+        </w:trPr>
         <w:tc>
           <w:p>
             <w:r>
@@ -602,6 +647,9 @@
         </w:tc>
       </w:tr>
       <w:tr>
+        <w:trPr>
+          <w:cantSplit w:val="on"/>
+        </w:trPr>
         <w:tc>
           <w:p>
             <w:r>
@@ -640,6 +688,9 @@
         </w:tc>
       </w:tr>
       <w:tr>
+        <w:trPr>
+          <w:cantSplit w:val="on"/>
+        </w:trPr>
         <w:tc>
           <w:p>
             <w:r>
@@ -678,6 +729,9 @@
         </w:tc>
       </w:tr>
       <w:tr>
+        <w:trPr>
+          <w:cantSplit w:val="on"/>
+        </w:trPr>
         <w:tc>
           <w:p>
             <w:r>
@@ -716,6 +770,9 @@
         </w:tc>
       </w:tr>
       <w:tr>
+        <w:trPr>
+          <w:cantSplit w:val="on"/>
+        </w:trPr>
         <w:tc>
           <w:p>
             <w:r>
@@ -754,6 +811,9 @@
         </w:tc>
       </w:tr>
       <w:tr>
+        <w:trPr>
+          <w:cantSplit w:val="on"/>
+        </w:trPr>
         <w:tc>
           <w:p>
             <w:r>
@@ -792,6 +852,9 @@
         </w:tc>
       </w:tr>
       <w:tr>
+        <w:trPr>
+          <w:cantSplit w:val="on"/>
+        </w:trPr>
         <w:tc>
           <w:p>
             <w:r>
@@ -830,6 +893,9 @@
         </w:tc>
       </w:tr>
       <w:tr>
+        <w:trPr>
+          <w:cantSplit w:val="on"/>
+        </w:trPr>
         <w:tc>
           <w:p>
             <w:r>
@@ -868,6 +934,9 @@
         </w:tc>
       </w:tr>
       <w:tr>
+        <w:trPr>
+          <w:cantSplit w:val="on"/>
+        </w:trPr>
         <w:tc>
           <w:p>
             <w:r>
@@ -906,6 +975,9 @@
         </w:tc>
       </w:tr>
       <w:tr>
+        <w:trPr>
+          <w:cantSplit w:val="on"/>
+        </w:trPr>
         <w:tc>
           <w:p>
             <w:r>
@@ -944,6 +1016,9 @@
         </w:tc>
       </w:tr>
       <w:tr>
+        <w:trPr>
+          <w:cantSplit w:val="on"/>
+        </w:trPr>
         <w:tc>
           <w:p>
             <w:r>
@@ -982,6 +1057,9 @@
         </w:tc>
       </w:tr>
       <w:tr>
+        <w:trPr>
+          <w:cantSplit w:val="on"/>
+        </w:trPr>
         <w:tc>
           <w:p>
             <w:r>
@@ -1020,6 +1098,9 @@
         </w:tc>
       </w:tr>
       <w:tr>
+        <w:trPr>
+          <w:cantSplit w:val="on"/>
+        </w:trPr>
         <w:tc>
           <w:p>
             <w:r>
@@ -1058,6 +1139,9 @@
         </w:tc>
       </w:tr>
       <w:tr>
+        <w:trPr>
+          <w:cantSplit w:val="on"/>
+        </w:trPr>
         <w:tc>
           <w:p>
             <w:r>
@@ -1096,6 +1180,9 @@
         </w:tc>
       </w:tr>
       <w:tr>
+        <w:trPr>
+          <w:cantSplit w:val="on"/>
+        </w:trPr>
         <w:tc>
           <w:p>
             <w:r>
@@ -1134,6 +1221,9 @@
         </w:tc>
       </w:tr>
       <w:tr>
+        <w:trPr>
+          <w:cantSplit w:val="on"/>
+        </w:trPr>
         <w:tc>
           <w:p>
             <w:r>
@@ -1172,6 +1262,9 @@
         </w:tc>
       </w:tr>
       <w:tr>
+        <w:trPr>
+          <w:cantSplit w:val="on"/>
+        </w:trPr>
         <w:tc>
           <w:p>
             <w:r>
@@ -1210,6 +1303,9 @@
         </w:tc>
       </w:tr>
       <w:tr>
+        <w:trPr>
+          <w:cantSplit w:val="on"/>
+        </w:trPr>
         <w:tc>
           <w:p>
             <w:r>
@@ -1248,6 +1344,9 @@
         </w:tc>
       </w:tr>
       <w:tr>
+        <w:trPr>
+          <w:cantSplit w:val="on"/>
+        </w:trPr>
         <w:tc>
           <w:p>
             <w:r>
@@ -1286,6 +1385,9 @@
         </w:tc>
       </w:tr>
       <w:tr>
+        <w:trPr>
+          <w:cantSplit w:val="on"/>
+        </w:trPr>
         <w:tc>
           <w:p>
             <w:r>
@@ -1324,6 +1426,9 @@
         </w:tc>
       </w:tr>
       <w:tr>
+        <w:trPr>
+          <w:cantSplit w:val="on"/>
+        </w:trPr>
         <w:tc>
           <w:p>
             <w:r>
@@ -1362,6 +1467,9 @@
         </w:tc>
       </w:tr>
       <w:tr>
+        <w:trPr>
+          <w:cantSplit w:val="on"/>
+        </w:trPr>
         <w:tc>
           <w:p>
             <w:r>
@@ -1400,6 +1508,9 @@
         </w:tc>
       </w:tr>
       <w:tr>
+        <w:trPr>
+          <w:cantSplit w:val="on"/>
+        </w:trPr>
         <w:tc>
           <w:p>
             <w:r>
@@ -1438,6 +1549,9 @@
         </w:tc>
       </w:tr>
       <w:tr>
+        <w:trPr>
+          <w:cantSplit w:val="on"/>
+        </w:trPr>
         <w:tc>
           <w:p>
             <w:r>
@@ -1476,6 +1590,9 @@
         </w:tc>
       </w:tr>
       <w:tr>
+        <w:trPr>
+          <w:cantSplit w:val="on"/>
+        </w:trPr>
         <w:tc>
           <w:p>
             <w:r>
@@ -1514,6 +1631,9 @@
         </w:tc>
       </w:tr>
       <w:tr>
+        <w:trPr>
+          <w:cantSplit w:val="on"/>
+        </w:trPr>
         <w:tc>
           <w:p>
             <w:r>
@@ -1552,6 +1672,9 @@
         </w:tc>
       </w:tr>
       <w:tr>
+        <w:trPr>
+          <w:cantSplit w:val="on"/>
+        </w:trPr>
         <w:tc>
           <w:p>
             <w:r>
@@ -1590,6 +1713,9 @@
         </w:tc>
       </w:tr>
       <w:tr>
+        <w:trPr>
+          <w:cantSplit w:val="on"/>
+        </w:trPr>
         <w:tc>
           <w:p>
             <w:r>
@@ -1628,6 +1754,9 @@
         </w:tc>
       </w:tr>
       <w:tr>
+        <w:trPr>
+          <w:cantSplit w:val="on"/>
+        </w:trPr>
         <w:tc>
           <w:p>
             <w:r>
@@ -1666,6 +1795,9 @@
         </w:tc>
       </w:tr>
       <w:tr>
+        <w:trPr>
+          <w:cantSplit w:val="on"/>
+        </w:trPr>
         <w:tc>
           <w:p>
             <w:r>
@@ -1704,6 +1836,9 @@
         </w:tc>
       </w:tr>
       <w:tr>
+        <w:trPr>
+          <w:cantSplit w:val="on"/>
+        </w:trPr>
         <w:tc>
           <w:p>
             <w:r>
@@ -1742,6 +1877,9 @@
         </w:tc>
       </w:tr>
       <w:tr>
+        <w:trPr>
+          <w:cantSplit w:val="on"/>
+        </w:trPr>
         <w:tc>
           <w:p>
             <w:r>
@@ -1780,6 +1918,9 @@
         </w:tc>
       </w:tr>
       <w:tr>
+        <w:trPr>
+          <w:cantSplit w:val="on"/>
+        </w:trPr>
         <w:tc>
           <w:p>
             <w:r>
@@ -1818,6 +1959,9 @@
         </w:tc>
       </w:tr>
       <w:tr>
+        <w:trPr>
+          <w:cantSplit w:val="on"/>
+        </w:trPr>
         <w:tc>
           <w:p>
             <w:r>
@@ -1856,6 +2000,9 @@
         </w:tc>
       </w:tr>
       <w:tr>
+        <w:trPr>
+          <w:cantSplit w:val="on"/>
+        </w:trPr>
         <w:tc>
           <w:p>
             <w:r>
@@ -1894,6 +2041,9 @@
         </w:tc>
       </w:tr>
       <w:tr>
+        <w:trPr>
+          <w:cantSplit w:val="on"/>
+        </w:trPr>
         <w:tc>
           <w:p>
             <w:r>
@@ -1932,6 +2082,9 @@
         </w:tc>
       </w:tr>
       <w:tr>
+        <w:trPr>
+          <w:cantSplit w:val="on"/>
+        </w:trPr>
         <w:tc>
           <w:p>
             <w:r>
@@ -1970,6 +2123,9 @@
         </w:tc>
       </w:tr>
       <w:tr>
+        <w:trPr>
+          <w:cantSplit w:val="on"/>
+        </w:trPr>
         <w:tc>
           <w:p>
             <w:r>
@@ -2008,6 +2164,9 @@
         </w:tc>
       </w:tr>
       <w:tr>
+        <w:trPr>
+          <w:cantSplit w:val="on"/>
+        </w:trPr>
         <w:tc>
           <w:p>
             <w:r>
@@ -2046,6 +2205,9 @@
         </w:tc>
       </w:tr>
       <w:tr>
+        <w:trPr>
+          <w:cantSplit w:val="on"/>
+        </w:trPr>
         <w:tc>
           <w:p>
             <w:r>
@@ -2084,6 +2246,9 @@
         </w:tc>
       </w:tr>
       <w:tr>
+        <w:trPr>
+          <w:cantSplit w:val="on"/>
+        </w:trPr>
         <w:tc>
           <w:p>
             <w:r>
@@ -2122,6 +2287,9 @@
         </w:tc>
       </w:tr>
       <w:tr>
+        <w:trPr>
+          <w:cantSplit w:val="on"/>
+        </w:trPr>
         <w:tc>
           <w:p>
             <w:r>
@@ -2160,6 +2328,9 @@
         </w:tc>
       </w:tr>
       <w:tr>
+        <w:trPr>
+          <w:cantSplit w:val="on"/>
+        </w:trPr>
         <w:tc>
           <w:p>
             <w:r>
@@ -2198,6 +2369,9 @@
         </w:tc>
       </w:tr>
       <w:tr>
+        <w:trPr>
+          <w:cantSplit w:val="on"/>
+        </w:trPr>
         <w:tc>
           <w:p>
             <w:r>
@@ -2236,6 +2410,9 @@
         </w:tc>
       </w:tr>
       <w:tr>
+        <w:trPr>
+          <w:cantSplit w:val="on"/>
+        </w:trPr>
         <w:tc>
           <w:p>
             <w:r>
@@ -2274,6 +2451,9 @@
         </w:tc>
       </w:tr>
       <w:tr>
+        <w:trPr>
+          <w:cantSplit w:val="on"/>
+        </w:trPr>
         <w:tc>
           <w:p>
             <w:r>
@@ -2312,6 +2492,9 @@
         </w:tc>
       </w:tr>
       <w:tr>
+        <w:trPr>
+          <w:cantSplit w:val="on"/>
+        </w:trPr>
         <w:tc>
           <w:p>
             <w:r>
@@ -2350,6 +2533,9 @@
         </w:tc>
       </w:tr>
       <w:tr>
+        <w:trPr>
+          <w:cantSplit w:val="on"/>
+        </w:trPr>
         <w:tc>
           <w:p>
             <w:r>
@@ -2388,6 +2574,9 @@
         </w:tc>
       </w:tr>
       <w:tr>
+        <w:trPr>
+          <w:cantSplit w:val="on"/>
+        </w:trPr>
         <w:tc>
           <w:p>
             <w:r>
@@ -2426,6 +2615,9 @@
         </w:tc>
       </w:tr>
       <w:tr>
+        <w:trPr>
+          <w:cantSplit w:val="on"/>
+        </w:trPr>
         <w:tc>
           <w:p>
             <w:r>
@@ -2464,6 +2656,9 @@
         </w:tc>
       </w:tr>
       <w:tr>
+        <w:trPr>
+          <w:cantSplit w:val="on"/>
+        </w:trPr>
         <w:tc>
           <w:p>
             <w:r>
@@ -2502,6 +2697,9 @@
         </w:tc>
       </w:tr>
       <w:tr>
+        <w:trPr>
+          <w:cantSplit w:val="on"/>
+        </w:trPr>
         <w:tc>
           <w:p>
             <w:r>
@@ -2540,6 +2738,9 @@
         </w:tc>
       </w:tr>
       <w:tr>
+        <w:trPr>
+          <w:cantSplit w:val="on"/>
+        </w:trPr>
         <w:tc>
           <w:p>
             <w:r>
@@ -2578,6 +2779,9 @@
         </w:tc>
       </w:tr>
       <w:tr>
+        <w:trPr>
+          <w:cantSplit w:val="on"/>
+        </w:trPr>
         <w:tc>
           <w:p>
             <w:r>
@@ -2616,6 +2820,9 @@
         </w:tc>
       </w:tr>
       <w:tr>
+        <w:trPr>
+          <w:cantSplit w:val="on"/>
+        </w:trPr>
         <w:tc>
           <w:p>
             <w:r>
@@ -2654,6 +2861,9 @@
         </w:tc>
       </w:tr>
       <w:tr>
+        <w:trPr>
+          <w:cantSplit w:val="on"/>
+        </w:trPr>
         <w:tc>
           <w:p>
             <w:r>
@@ -2692,6 +2902,9 @@
         </w:tc>
       </w:tr>
       <w:tr>
+        <w:trPr>
+          <w:cantSplit w:val="on"/>
+        </w:trPr>
         <w:tc>
           <w:p>
             <w:r>
@@ -2730,6 +2943,9 @@
         </w:tc>
       </w:tr>
       <w:tr>
+        <w:trPr>
+          <w:cantSplit w:val="on"/>
+        </w:trPr>
         <w:tc>
           <w:p>
             <w:r>
@@ -2768,6 +2984,9 @@
         </w:tc>
       </w:tr>
       <w:tr>
+        <w:trPr>
+          <w:cantSplit w:val="on"/>
+        </w:trPr>
         <w:tc>
           <w:p>
             <w:r>
@@ -2806,6 +3025,9 @@
         </w:tc>
       </w:tr>
       <w:tr>
+        <w:trPr>
+          <w:cantSplit w:val="on"/>
+        </w:trPr>
         <w:tc>
           <w:p>
             <w:r>
@@ -2844,6 +3066,9 @@
         </w:tc>
       </w:tr>
       <w:tr>
+        <w:trPr>
+          <w:cantSplit w:val="on"/>
+        </w:trPr>
         <w:tc>
           <w:p>
             <w:r>
@@ -2882,6 +3107,9 @@
         </w:tc>
       </w:tr>
       <w:tr>
+        <w:trPr>
+          <w:cantSplit w:val="on"/>
+        </w:trPr>
         <w:tc>
           <w:p>
             <w:r>
@@ -2920,6 +3148,9 @@
         </w:tc>
       </w:tr>
       <w:tr>
+        <w:trPr>
+          <w:cantSplit w:val="on"/>
+        </w:trPr>
         <w:tc>
           <w:p>
             <w:r>
@@ -2958,6 +3189,9 @@
         </w:tc>
       </w:tr>
       <w:tr>
+        <w:trPr>
+          <w:cantSplit w:val="on"/>
+        </w:trPr>
         <w:tc>
           <w:p>
             <w:r>
@@ -2996,6 +3230,9 @@
         </w:tc>
       </w:tr>
       <w:tr>
+        <w:trPr>
+          <w:cantSplit w:val="on"/>
+        </w:trPr>
         <w:tc>
           <w:p>
             <w:r>
@@ -3034,6 +3271,9 @@
         </w:tc>
       </w:tr>
       <w:tr>
+        <w:trPr>
+          <w:cantSplit w:val="on"/>
+        </w:trPr>
         <w:tc>
           <w:p>
             <w:r>
@@ -3072,6 +3312,9 @@
         </w:tc>
       </w:tr>
       <w:tr>
+        <w:trPr>
+          <w:cantSplit w:val="on"/>
+        </w:trPr>
         <w:tc>
           <w:p>
             <w:r>
@@ -3110,6 +3353,9 @@
         </w:tc>
       </w:tr>
       <w:tr>
+        <w:trPr>
+          <w:cantSplit w:val="on"/>
+        </w:trPr>
         <w:tc>
           <w:p>
             <w:r>
@@ -3148,6 +3394,9 @@
         </w:tc>
       </w:tr>
       <w:tr>
+        <w:trPr>
+          <w:cantSplit w:val="on"/>
+        </w:trPr>
         <w:tc>
           <w:p>
             <w:r>
@@ -3186,6 +3435,9 @@
         </w:tc>
       </w:tr>
       <w:tr>
+        <w:trPr>
+          <w:cantSplit w:val="on"/>
+        </w:trPr>
         <w:tc>
           <w:p>
             <w:r>
@@ -3224,6 +3476,9 @@
         </w:tc>
       </w:tr>
       <w:tr>
+        <w:trPr>
+          <w:cantSplit w:val="on"/>
+        </w:trPr>
         <w:tc>
           <w:p>
             <w:r>
@@ -3262,6 +3517,9 @@
         </w:tc>
       </w:tr>
       <w:tr>
+        <w:trPr>
+          <w:cantSplit w:val="on"/>
+        </w:trPr>
         <w:tc>
           <w:p>
             <w:r>
@@ -3300,6 +3558,9 @@
         </w:tc>
       </w:tr>
       <w:tr>
+        <w:trPr>
+          <w:cantSplit w:val="on"/>
+        </w:trPr>
         <w:tc>
           <w:p>
             <w:r>
@@ -3338,6 +3599,9 @@
         </w:tc>
       </w:tr>
       <w:tr>
+        <w:trPr>
+          <w:cantSplit w:val="on"/>
+        </w:trPr>
         <w:tc>
           <w:p>
             <w:r>
@@ -3376,6 +3640,9 @@
         </w:tc>
       </w:tr>
       <w:tr>
+        <w:trPr>
+          <w:cantSplit w:val="on"/>
+        </w:trPr>
         <w:tc>
           <w:p>
             <w:r>
@@ -3414,6 +3681,9 @@
         </w:tc>
       </w:tr>
       <w:tr>
+        <w:trPr>
+          <w:cantSplit w:val="on"/>
+        </w:trPr>
         <w:tc>
           <w:p>
             <w:r>
@@ -3452,6 +3722,9 @@
         </w:tc>
       </w:tr>
       <w:tr>
+        <w:trPr>
+          <w:cantSplit w:val="on"/>
+        </w:trPr>
         <w:tc>
           <w:p>
             <w:r>
@@ -3490,6 +3763,9 @@
         </w:tc>
       </w:tr>
       <w:tr>
+        <w:trPr>
+          <w:cantSplit w:val="on"/>
+        </w:trPr>
         <w:tc>
           <w:p>
             <w:r>
@@ -3528,6 +3804,9 @@
         </w:tc>
       </w:tr>
       <w:tr>
+        <w:trPr>
+          <w:cantSplit w:val="on"/>
+        </w:trPr>
         <w:tc>
           <w:p>
             <w:r>
@@ -3566,6 +3845,9 @@
         </w:tc>
       </w:tr>
       <w:tr>
+        <w:trPr>
+          <w:cantSplit w:val="on"/>
+        </w:trPr>
         <w:tc>
           <w:p>
             <w:r>
@@ -3604,6 +3886,9 @@
         </w:tc>
       </w:tr>
       <w:tr>
+        <w:trPr>
+          <w:cantSplit w:val="on"/>
+        </w:trPr>
         <w:tc>
           <w:p>
             <w:r>
@@ -3642,6 +3927,9 @@
         </w:tc>
       </w:tr>
       <w:tr>
+        <w:trPr>
+          <w:cantSplit w:val="on"/>
+        </w:trPr>
         <w:tc>
           <w:p>
             <w:r>
@@ -3680,6 +3968,9 @@
         </w:tc>
       </w:tr>
       <w:tr>
+        <w:trPr>
+          <w:cantSplit w:val="on"/>
+        </w:trPr>
         <w:tc>
           <w:p>
             <w:r>
@@ -3718,6 +4009,9 @@
         </w:tc>
       </w:tr>
       <w:tr>
+        <w:trPr>
+          <w:cantSplit w:val="on"/>
+        </w:trPr>
         <w:tc>
           <w:p>
             <w:r>
@@ -3756,6 +4050,9 @@
         </w:tc>
       </w:tr>
       <w:tr>
+        <w:trPr>
+          <w:cantSplit w:val="on"/>
+        </w:trPr>
         <w:tc>
           <w:p>
             <w:r>
@@ -3794,6 +4091,9 @@
         </w:tc>
       </w:tr>
       <w:tr>
+        <w:trPr>
+          <w:cantSplit w:val="on"/>
+        </w:trPr>
         <w:tc>
           <w:p>
             <w:r>
@@ -3832,6 +4132,9 @@
         </w:tc>
       </w:tr>
       <w:tr>
+        <w:trPr>
+          <w:cantSplit w:val="on"/>
+        </w:trPr>
         <w:tc>
           <w:p>
             <w:r>
@@ -3872,7 +4175,7 @@
     </w:tbl>
     <w:sectPr>
       <w:pgSz w:w="11906" w:h="16838" w:orient="portrait"/>
-      <w:pgMar w:top="1134" w:bottom="1134" w:left="1134" w:right="1134"/>
+      <w:pgMar w:top="680" w:bottom="680" w:left="567" w:right="567"/>
     </w:sectPr>
   </w:body>
 </w:document>
@@ -3880,6 +4183,53 @@
 
 <file path=word/numbering.xml><?xml version="1.0" encoding="utf-8"?>
 <w:numbering xmlns:w="http://schemas.openxmlformats.org/wordprocessingml/2006/main">
+  <w:abstractNum w:abstractNumId="10">
+    <w:lvl w:ilvl="0">
+      <w:start w:val="1"/>
+      <w:numFmt w:val="decimal"/>
+      <w:lvlText w:val="%1."/>
+    </w:lvl>
+    <w:lvl w:ilvl="1">
+      <w:start w:val="1"/>
+      <w:numFmt w:val="decimal"/>
+      <w:lvlText w:val="%2."/>
+    </w:lvl>
+    <w:lvl w:ilvl="2">
+      <w:start w:val="1"/>
+      <w:numFmt w:val="decimal"/>
+      <w:lvlText w:val="%3."/>
+    </w:lvl>
+    <w:lvl w:ilvl="3">
+      <w:start w:val="1"/>
+      <w:numFmt w:val="decimal"/>
+      <w:lvlText w:val="%4."/>
+    </w:lvl>
+    <w:lvl w:ilvl="4">
+      <w:start w:val="1"/>
+      <w:numFmt w:val="decimal"/>
+      <w:lvlText w:val="%5."/>
+    </w:lvl>
+    <w:lvl w:ilvl="5">
+      <w:start w:val="1"/>
+      <w:numFmt w:val="decimal"/>
+      <w:lvlText w:val="%6."/>
+    </w:lvl>
+    <w:lvl w:ilvl="6">
+      <w:start w:val="1"/>
+      <w:numFmt w:val="decimal"/>
+      <w:lvlText w:val="%7."/>
+    </w:lvl>
+    <w:lvl w:ilvl="7">
+      <w:start w:val="1"/>
+      <w:numFmt w:val="decimal"/>
+      <w:lvlText w:val="%8."/>
+    </w:lvl>
+    <w:lvl w:ilvl="8">
+      <w:start w:val="1"/>
+      <w:numFmt w:val="decimal"/>
+      <w:lvlText w:val="%9."/>
+    </w:lvl>
+  </w:abstractNum>
   <w:abstractNum w:abstractNumId="11">
     <w:lvl w:ilvl="0">
       <w:start w:val="1"/>
@@ -3927,58 +4277,11 @@
       <w:lvlText w:val="•"/>
     </w:lvl>
   </w:abstractNum>
-  <w:abstractNum w:abstractNumId="10">
-    <w:lvl w:ilvl="0">
-      <w:start w:val="1"/>
-      <w:numFmt w:val="decimal"/>
-      <w:lvlText w:val="%1."/>
-    </w:lvl>
-    <w:lvl w:ilvl="1">
-      <w:start w:val="1"/>
-      <w:numFmt w:val="decimal"/>
-      <w:lvlText w:val="%2."/>
-    </w:lvl>
-    <w:lvl w:ilvl="2">
-      <w:start w:val="1"/>
-      <w:numFmt w:val="decimal"/>
-      <w:lvlText w:val="%3."/>
-    </w:lvl>
-    <w:lvl w:ilvl="3">
-      <w:start w:val="1"/>
-      <w:numFmt w:val="decimal"/>
-      <w:lvlText w:val="%4."/>
-    </w:lvl>
-    <w:lvl w:ilvl="4">
-      <w:start w:val="1"/>
-      <w:numFmt w:val="decimal"/>
-      <w:lvlText w:val="%5."/>
-    </w:lvl>
-    <w:lvl w:ilvl="5">
-      <w:start w:val="1"/>
-      <w:numFmt w:val="decimal"/>
-      <w:lvlText w:val="%6."/>
-    </w:lvl>
-    <w:lvl w:ilvl="6">
-      <w:start w:val="1"/>
-      <w:numFmt w:val="decimal"/>
-      <w:lvlText w:val="%7."/>
-    </w:lvl>
-    <w:lvl w:ilvl="7">
-      <w:start w:val="1"/>
-      <w:numFmt w:val="decimal"/>
-      <w:lvlText w:val="%8."/>
-    </w:lvl>
-    <w:lvl w:ilvl="8">
-      <w:start w:val="1"/>
-      <w:numFmt w:val="decimal"/>
-      <w:lvlText w:val="%9."/>
-    </w:lvl>
-  </w:abstractNum>
   <w:num w:numId="1">
-    <w:abstractNumId w:val="11"/>
+    <w:abstractNumId w:val="10"/>
   </w:num>
   <w:num w:numId="2">
-    <w:abstractNumId w:val="10"/>
+    <w:abstractNumId w:val="11"/>
   </w:num>
 </w:numbering>
 </file>
</xml_diff>